<commit_message>
Promemoria automatico agli allievi che smettono di esercitarsi
Nuovo scripts/promemoria_studio.py, da cron una volta al giorno alle 18:00:
avvisa l'allievo che non completa una scheda da due giorni, con frasi brevi
a rotazione e link diretto alla sezione esercitazioni.

- si guarda l'ultima scheda COMPLETATA, non l'ultimo accesso: chi apre l'app
  senza rispondere a una domanda si e' fermato lo stesso
- tetto di 2 promemoria a settimana per allievo, piu' il blocco dei doppioni
  nello stesso giorno se il job venisse lanciato due volte
- restano fuori chi ha gia' fatto l'esame e chi si e' appena iscritto

Per accogliere il nuovo tipo di notifica il vincolo su notifica.tipo va
allargato: SQLite non lo sa fare con un ALTER, quindi db.py ricostruisce la
tabella una sola volta all'avvio, ricopiando lo storico.

Manuale d'uso e checklist di consegna aggiornati.

Co-Authored-By: Claude Opus 5 <noreply@anthropic.com>
Claude-Session: https://claude.ai/code/session_01Qsa5Z5Unj9EeBnEh291puG
</commit_message>
<xml_diff>
--- a/Cruscotto_checklist_consegna.docx
+++ b/Cruscotto_checklist_consegna.docx
@@ -403,6 +403,29 @@
           <w:szCs w:val="21"/>
         </w:rPr>
         <w:t>Notifiche automatiche all'allievo quando la scuola programma una diretta, quando la avvia e quando pubblica una nuova videolezione registrata: popup sul telefono/PC se ha dato il permesso, più uno storico sempre disponibile nel campanellino dell'interfaccia. Nessun servizio esterno a pagamento: chiavi generate una volta sola, già pronte.</w:t>
+      </w:r>
+    </w:p>
+    <w:p>
+      <w:pPr>
+        <w:spacing w:after="80" w:line="280"/>
+      </w:pPr>
+      <w:r>
+        <w:rPr>
+          <w:b/>
+          <w:bCs/>
+          <w:color w:val="198754"/>
+          <w:sz w:val="21"/>
+          <w:szCs w:val="21"/>
+        </w:rPr>
+        <w:t xml:space="preserve">✓  </w:t>
+      </w:r>
+      <w:r>
+        <w:rPr>
+          <w:color w:val="1F2328"/>
+          <w:sz w:val="21"/>
+          <w:szCs w:val="21"/>
+        </w:rPr>
+        <w:t>Promemoria automatico di studio: l'allievo fermo da due giorni riceve la sera un invito a fare qualche quiz, con frasi che cambiano a rotazione e un tetto di due a settimana per non risultare molesto.</w:t>
       </w:r>
     </w:p>
     <w:p>

</xml_diff>